<commit_message>
Actualización de datos en mongo dinamicamente
</commit_message>
<xml_diff>
--- a/Morosos/Carta recordatorio de pagos cpcs.docx
+++ b/Morosos/Carta recordatorio de pagos cpcs.docx
@@ -195,7 +195,7 @@
           <w:szCs w:val="20"/>
           <w:lang w:eastAsia="es-CO"/>
         </w:rPr>
-        <w:t>7 julio de 2026</w:t>
+        <w:t>2 septiembre de 2026</w:t>
       </w:r>
       <w:r>
         <w:rPr>
@@ -506,7 +506,29 @@
           <w:szCs w:val="20"/>
           <w:lang w:eastAsia="es-CO"/>
         </w:rPr>
-        <w:t>Administrador General</w:t>
+        <w:t>Administrador</w:t>
+      </w:r>
+      <w:r>
+        <w:rPr>
+          <w:rStyle w:val="15ogck0"/>
+          <w:b/>
+          <w:bCs/>
+          <w:sz w:val="20"/>
+          <w:szCs w:val="20"/>
+          <w:lang w:eastAsia="es-CO"/>
+        </w:rPr>
+        <w:t>a</w:t>
+      </w:r>
+      <w:r>
+        <w:rPr>
+          <w:rStyle w:val="15ogck0"/>
+          <w:b/>
+          <w:bCs/>
+          <w:sz w:val="20"/>
+          <w:szCs w:val="20"/>
+          <w:lang w:eastAsia="es-CO"/>
+        </w:rPr>
+        <w:t xml:space="preserve"> General</w:t>
       </w:r>
     </w:p>
     <w:p>
@@ -702,7 +724,7 @@
           <w:szCs w:val="20"/>
           <w:lang w:eastAsia="es-CO"/>
         </w:rPr>
-        <w:t>Mayo - Junio</w:t>
+        <w:t>Julio - Agosto</w:t>
       </w:r>
       <w:r>
         <w:rPr>
@@ -798,7 +820,7 @@
           <w:szCs w:val="20"/>
           <w:lang w:eastAsia="es-CO"/>
         </w:rPr>
-        <w:t>1157380</w:t>
+        <w:t>1157132</w:t>
       </w:r>
       <w:r>
         <w:rPr>
@@ -863,7 +885,7 @@
           <w:szCs w:val="20"/>
           <w:lang w:eastAsia="es-CO"/>
         </w:rPr>
-        <w:t>9</w:t>
+        <w:t>08</w:t>
       </w:r>
       <w:r>
         <w:rPr>
@@ -917,7 +939,7 @@
           <w:szCs w:val="20"/>
           <w:lang w:eastAsia="es-CO"/>
         </w:rPr>
-        <w:t>Julio</w:t>
+        <w:t>Septiembre</w:t>
       </w:r>
       <w:r>
         <w:rPr>
@@ -1043,7 +1065,7 @@
           <w:szCs w:val="20"/>
           <w:lang w:eastAsia="es-CO"/>
         </w:rPr>
-        <w:t>7 am</w:t>
+        <w:t>7 a.m.</w:t>
       </w:r>
       <w:r>
         <w:rPr>
@@ -2136,97 +2158,6 @@
     <w:abstractNumId w:val="3"/>
   </w:num>
 </w:numbering>
-</file>
-
-<file path=word/recipientData.xml><?xml version="1.0" encoding="utf-8"?>
-<wne:recipients xmlns:wpc="http://schemas.microsoft.com/office/word/2010/wordprocessingCanvas" xmlns:cx="http://schemas.microsoft.com/office/drawing/2014/chartex" xmlns:cx1="http://schemas.microsoft.com/office/drawing/2015/9/8/chartex" xmlns:cx2="http://schemas.microsoft.com/office/drawing/2015/10/21/chartex" xmlns:cx3="http://schemas.microsoft.com/office/drawing/2016/5/9/chartex" xmlns:cx4="http://schemas.microsoft.com/office/drawing/2016/5/10/chartex" xmlns:cx5="http://schemas.microsoft.com/office/drawing/2016/5/11/chartex" xmlns:cx6="http://schemas.microsoft.com/office/drawing/2016/5/12/chartex" xmlns:cx7="http://schemas.microsoft.com/office/drawing/2016/5/13/chartex" xmlns:cx8="http://schemas.microsoft.com/office/drawing/2016/5/14/chartex" xmlns:mc="http://schemas.openxmlformats.org/markup-compatibility/2006" xmlns:aink="http://schemas.microsoft.com/office/drawing/2016/ink" xmlns:am3d="http://schemas.microsoft.com/office/drawing/2017/model3d" xmlns:o="urn:schemas-microsoft-com:office:office" xmlns:oel="http://schemas.microsoft.com/office/2019/extlst" xmlns:r="http://schemas.openxmlformats.org/officeDocument/2006/relationships" xmlns:m="http://schemas.openxmlformats.org/officeDocument/2006/math" xmlns:v="urn:schemas-microsoft-com:vml" xmlns:wp14="http://schemas.microsoft.com/office/word/2010/wordprocessingDrawing" xmlns:wp="http://schemas.openxmlformats.org/drawingml/2006/wordprocessingDrawing" xmlns:w10="urn:schemas-microsoft-com:office:word" xmlns:w="http://schemas.openxmlformats.org/wordprocessingml/2006/main" xmlns:w14="http://schemas.microsoft.com/office/word/2010/wordml" xmlns:w15="http://schemas.microsoft.com/office/word/2012/wordml" xmlns:w16cex="http://schemas.microsoft.com/office/word/2018/wordml/cex" xmlns:w16cid="http://schemas.microsoft.com/office/word/2016/wordml/cid" xmlns:w16="http://schemas.microsoft.com/office/word/2018/wordml" xmlns:w16du="http://schemas.microsoft.com/office/word/2023/wordml/word16du" xmlns:w16sdtdh="http://schemas.microsoft.com/office/word/2020/wordml/sdtdatahash" xmlns:w16sdtfl="http://schemas.microsoft.com/office/word/2024/wordml/sdtformatlock" xmlns:w16se="http://schemas.microsoft.com/office/word/2015/wordml/symex" xmlns:wpg="http://schemas.microsoft.com/office/word/2010/wordprocessingGroup" xmlns:wpi="http://schemas.microsoft.com/office/word/2010/wordprocessingInk" xmlns:wne="http://schemas.microsoft.com/office/word/2006/wordml" xmlns:wps="http://schemas.microsoft.com/office/word/2010/wordprocessingShape" mc:Ignorable="w14 w15 w16se w16cid w16 w16cex w16sdtdh w16sdtfl w16du wp14">
-  <wne:recipientData>
-    <wne:active wne:val="1"/>
-    <wne:hash wne:val="-579115763"/>
-  </wne:recipientData>
-  <wne:recipientData>
-    <wne:active wne:val="1"/>
-    <wne:hash wne:val="-1602585324"/>
-  </wne:recipientData>
-  <wne:recipientData>
-    <wne:active wne:val="1"/>
-    <wne:hash wne:val="-1631248440"/>
-  </wne:recipientData>
-  <wne:recipientData>
-    <wne:active wne:val="1"/>
-    <wne:hash wne:val="2144903730"/>
-  </wne:recipientData>
-  <wne:recipientData>
-    <wne:active wne:val="1"/>
-    <wne:hash wne:val="1742134737"/>
-  </wne:recipientData>
-  <wne:recipientData>
-    <wne:active wne:val="1"/>
-    <wne:hash wne:val="-254442812"/>
-  </wne:recipientData>
-  <wne:recipientData>
-    <wne:active wne:val="1"/>
-    <wne:hash wne:val="1244508745"/>
-  </wne:recipientData>
-  <wne:recipientData>
-    <wne:active wne:val="1"/>
-    <wne:hash wne:val="-1275055736"/>
-  </wne:recipientData>
-  <wne:recipientData>
-    <wne:active wne:val="1"/>
-    <wne:hash wne:val="18727534"/>
-  </wne:recipientData>
-  <wne:recipientData>
-    <wne:active wne:val="1"/>
-    <wne:hash wne:val="-2024596636"/>
-  </wne:recipientData>
-  <wne:recipientData>
-    <wne:active wne:val="1"/>
-    <wne:hash wne:val="1082789285"/>
-  </wne:recipientData>
-  <wne:recipientData>
-    <wne:active wne:val="1"/>
-    <wne:hash wne:val="781392020"/>
-  </wne:recipientData>
-  <wne:recipientData>
-    <wne:active wne:val="1"/>
-    <wne:hash wne:val="-529069215"/>
-  </wne:recipientData>
-  <wne:recipientData>
-    <wne:active wne:val="1"/>
-    <wne:hash wne:val="1039876100"/>
-  </wne:recipientData>
-  <wne:recipientData>
-    <wne:active wne:val="1"/>
-    <wne:hash wne:val="-143495247"/>
-  </wne:recipientData>
-  <wne:recipientData>
-    <wne:active wne:val="1"/>
-    <wne:hash wne:val="56635276"/>
-  </wne:recipientData>
-  <wne:recipientData>
-    <wne:active wne:val="1"/>
-    <wne:hash wne:val="949781927"/>
-  </wne:recipientData>
-  <wne:recipientData>
-    <wne:active wne:val="1"/>
-    <wne:hash wne:val="-907703432"/>
-  </wne:recipientData>
-  <wne:recipientData>
-    <wne:active wne:val="1"/>
-    <wne:hash wne:val="-1233601477"/>
-  </wne:recipientData>
-  <wne:recipientData>
-    <wne:active wne:val="1"/>
-    <wne:hash wne:val="-139596387"/>
-  </wne:recipientData>
-  <wne:recipientData>
-    <wne:active wne:val="1"/>
-  </wne:recipientData>
-  <wne:recipientData>
-    <wne:active wne:val="1"/>
-  </wne:recipientData>
-</wne:recipients>
 </file>
 
 <file path=word/styles.xml><?xml version="1.0" encoding="utf-8"?>

</xml_diff>

<commit_message>
Backup 20 de oct
</commit_message>
<xml_diff>
--- a/Morosos/Carta recordatorio de pagos cpcs.docx
+++ b/Morosos/Carta recordatorio de pagos cpcs.docx
@@ -195,7 +195,7 @@
           <w:szCs w:val="20"/>
           <w:lang w:eastAsia="es-CO"/>
         </w:rPr>
-        <w:t>2 septiembre de 2026</w:t>
+        <w:t>1 de octubre de 2026</w:t>
       </w:r>
       <w:r>
         <w:rPr>
@@ -724,7 +724,7 @@
           <w:szCs w:val="20"/>
           <w:lang w:eastAsia="es-CO"/>
         </w:rPr>
-        <w:t>Julio - Agosto</w:t>
+        <w:t>Agosto - Septiembre</w:t>
       </w:r>
       <w:r>
         <w:rPr>
@@ -820,7 +820,7 @@
           <w:szCs w:val="20"/>
           <w:lang w:eastAsia="es-CO"/>
         </w:rPr>
-        <w:t>1157132</w:t>
+        <w:t>1157752</w:t>
       </w:r>
       <w:r>
         <w:rPr>
@@ -885,7 +885,7 @@
           <w:szCs w:val="20"/>
           <w:lang w:eastAsia="es-CO"/>
         </w:rPr>
-        <w:t>08</w:t>
+        <w:t>14</w:t>
       </w:r>
       <w:r>
         <w:rPr>
@@ -939,7 +939,7 @@
           <w:szCs w:val="20"/>
           <w:lang w:eastAsia="es-CO"/>
         </w:rPr>
-        <w:t>Septiembre</w:t>
+        <w:t>Octubre</w:t>
       </w:r>
       <w:r>
         <w:rPr>

</xml_diff>